<commit_message>
Learn select, where and like
</commit_message>
<xml_diff>
--- a/section33_postgreSQL/section33_postgreSQLNotes.docx
+++ b/section33_postgreSQL/section33_postgreSQLNotes.docx
@@ -1877,6 +1877,101 @@
           <w:szCs w:val="28"/>
         </w:rPr>
         <w:t>CSV – Comma Separated Values.</w:t>
+      </w:r>
+    </w:p>
+    <w:p>
+      <w:pPr>
+        <w:rPr>
+          <w:rFonts w:ascii="Times New Roman" w:hAnsi="Times New Roman" w:cs="Times New Roman"/>
+          <w:b/>
+          <w:bCs/>
+          <w:sz w:val="28"/>
+          <w:szCs w:val="28"/>
+        </w:rPr>
+      </w:pPr>
+      <w:r>
+        <w:rPr>
+          <w:rFonts w:ascii="Times New Roman" w:hAnsi="Times New Roman" w:cs="Times New Roman"/>
+          <w:b/>
+          <w:bCs/>
+          <w:sz w:val="28"/>
+          <w:szCs w:val="28"/>
+        </w:rPr>
+        <w:t>253. Query data using SELECT, WHERE and LIKE</w:t>
+      </w:r>
+    </w:p>
+    <w:p>
+      <w:pPr>
+        <w:pStyle w:val="ListParagraph"/>
+        <w:numPr>
+          <w:ilvl w:val="0"/>
+          <w:numId w:val="4"/>
+        </w:numPr>
+        <w:rPr>
+          <w:rFonts w:ascii="Times New Roman" w:hAnsi="Times New Roman" w:cs="Times New Roman"/>
+          <w:sz w:val="28"/>
+          <w:szCs w:val="28"/>
+        </w:rPr>
+      </w:pPr>
+      <w:r>
+        <w:rPr>
+          <w:rFonts w:ascii="Times New Roman" w:hAnsi="Times New Roman" w:cs="Times New Roman"/>
+          <w:sz w:val="28"/>
+          <w:szCs w:val="28"/>
+        </w:rPr>
+        <w:t>Various select methods:</w:t>
+      </w:r>
+    </w:p>
+    <w:p>
+      <w:pPr>
+        <w:ind w:left="360"/>
+        <w:rPr>
+          <w:rFonts w:ascii="Times New Roman" w:hAnsi="Times New Roman" w:cs="Times New Roman"/>
+          <w:sz w:val="28"/>
+          <w:szCs w:val="28"/>
+        </w:rPr>
+      </w:pPr>
+      <w:r>
+        <w:rPr>
+          <w:rFonts w:ascii="Times New Roman" w:hAnsi="Times New Roman" w:cs="Times New Roman"/>
+          <w:sz w:val="28"/>
+          <w:szCs w:val="28"/>
+        </w:rPr>
+        <w:drawing>
+          <wp:inline distT="0" distB="0" distL="0" distR="0" wp14:anchorId="5B2742AF" wp14:editId="0C3616DC">
+            <wp:extent cx="5416828" cy="2444876"/>
+            <wp:effectExtent l="0" t="0" r="0" b="0"/>
+            <wp:docPr id="1859816179" name="Picture 1"/>
+            <wp:cNvGraphicFramePr>
+              <a:graphicFrameLocks xmlns:a="http://schemas.openxmlformats.org/drawingml/2006/main" noChangeAspect="1"/>
+            </wp:cNvGraphicFramePr>
+            <a:graphic xmlns:a="http://schemas.openxmlformats.org/drawingml/2006/main">
+              <a:graphicData uri="http://schemas.openxmlformats.org/drawingml/2006/picture">
+                <pic:pic xmlns:pic="http://schemas.openxmlformats.org/drawingml/2006/picture">
+                  <pic:nvPicPr>
+                    <pic:cNvPr id="1859816179" name=""/>
+                    <pic:cNvPicPr/>
+                  </pic:nvPicPr>
+                  <pic:blipFill>
+                    <a:blip r:embed="rId6"/>
+                    <a:stretch>
+                      <a:fillRect/>
+                    </a:stretch>
+                  </pic:blipFill>
+                  <pic:spPr>
+                    <a:xfrm>
+                      <a:off x="0" y="0"/>
+                      <a:ext cx="5416828" cy="2444876"/>
+                    </a:xfrm>
+                    <a:prstGeom prst="rect">
+                      <a:avLst/>
+                    </a:prstGeom>
+                  </pic:spPr>
+                </pic:pic>
+              </a:graphicData>
+            </a:graphic>
+          </wp:inline>
+        </w:drawing>
       </w:r>
     </w:p>
     <w:sectPr>
@@ -2230,6 +2325,119 @@
       </w:rPr>
     </w:lvl>
   </w:abstractNum>
+  <w:abstractNum w:abstractNumId="3" w15:restartNumberingAfterBreak="0">
+    <w:nsid w:val="62C60005"/>
+    <w:multiLevelType w:val="hybridMultilevel"/>
+    <w:tmpl w:val="EDF6A660"/>
+    <w:lvl w:ilvl="0" w:tplc="40090001">
+      <w:start w:val="1"/>
+      <w:numFmt w:val="bullet"/>
+      <w:lvlText w:val=""/>
+      <w:lvlJc w:val="left"/>
+      <w:pPr>
+        <w:ind w:left="720" w:hanging="360"/>
+      </w:pPr>
+      <w:rPr>
+        <w:rFonts w:ascii="Symbol" w:hAnsi="Symbol" w:hint="default"/>
+      </w:rPr>
+    </w:lvl>
+    <w:lvl w:ilvl="1" w:tplc="40090003" w:tentative="1">
+      <w:start w:val="1"/>
+      <w:numFmt w:val="bullet"/>
+      <w:lvlText w:val="o"/>
+      <w:lvlJc w:val="left"/>
+      <w:pPr>
+        <w:ind w:left="1440" w:hanging="360"/>
+      </w:pPr>
+      <w:rPr>
+        <w:rFonts w:ascii="Courier New" w:hAnsi="Courier New" w:cs="Courier New" w:hint="default"/>
+      </w:rPr>
+    </w:lvl>
+    <w:lvl w:ilvl="2" w:tplc="40090005" w:tentative="1">
+      <w:start w:val="1"/>
+      <w:numFmt w:val="bullet"/>
+      <w:lvlText w:val=""/>
+      <w:lvlJc w:val="left"/>
+      <w:pPr>
+        <w:ind w:left="2160" w:hanging="360"/>
+      </w:pPr>
+      <w:rPr>
+        <w:rFonts w:ascii="Wingdings" w:hAnsi="Wingdings" w:hint="default"/>
+      </w:rPr>
+    </w:lvl>
+    <w:lvl w:ilvl="3" w:tplc="40090001" w:tentative="1">
+      <w:start w:val="1"/>
+      <w:numFmt w:val="bullet"/>
+      <w:lvlText w:val=""/>
+      <w:lvlJc w:val="left"/>
+      <w:pPr>
+        <w:ind w:left="2880" w:hanging="360"/>
+      </w:pPr>
+      <w:rPr>
+        <w:rFonts w:ascii="Symbol" w:hAnsi="Symbol" w:hint="default"/>
+      </w:rPr>
+    </w:lvl>
+    <w:lvl w:ilvl="4" w:tplc="40090003" w:tentative="1">
+      <w:start w:val="1"/>
+      <w:numFmt w:val="bullet"/>
+      <w:lvlText w:val="o"/>
+      <w:lvlJc w:val="left"/>
+      <w:pPr>
+        <w:ind w:left="3600" w:hanging="360"/>
+      </w:pPr>
+      <w:rPr>
+        <w:rFonts w:ascii="Courier New" w:hAnsi="Courier New" w:cs="Courier New" w:hint="default"/>
+      </w:rPr>
+    </w:lvl>
+    <w:lvl w:ilvl="5" w:tplc="40090005" w:tentative="1">
+      <w:start w:val="1"/>
+      <w:numFmt w:val="bullet"/>
+      <w:lvlText w:val=""/>
+      <w:lvlJc w:val="left"/>
+      <w:pPr>
+        <w:ind w:left="4320" w:hanging="360"/>
+      </w:pPr>
+      <w:rPr>
+        <w:rFonts w:ascii="Wingdings" w:hAnsi="Wingdings" w:hint="default"/>
+      </w:rPr>
+    </w:lvl>
+    <w:lvl w:ilvl="6" w:tplc="40090001" w:tentative="1">
+      <w:start w:val="1"/>
+      <w:numFmt w:val="bullet"/>
+      <w:lvlText w:val=""/>
+      <w:lvlJc w:val="left"/>
+      <w:pPr>
+        <w:ind w:left="5040" w:hanging="360"/>
+      </w:pPr>
+      <w:rPr>
+        <w:rFonts w:ascii="Symbol" w:hAnsi="Symbol" w:hint="default"/>
+      </w:rPr>
+    </w:lvl>
+    <w:lvl w:ilvl="7" w:tplc="40090003" w:tentative="1">
+      <w:start w:val="1"/>
+      <w:numFmt w:val="bullet"/>
+      <w:lvlText w:val="o"/>
+      <w:lvlJc w:val="left"/>
+      <w:pPr>
+        <w:ind w:left="5760" w:hanging="360"/>
+      </w:pPr>
+      <w:rPr>
+        <w:rFonts w:ascii="Courier New" w:hAnsi="Courier New" w:cs="Courier New" w:hint="default"/>
+      </w:rPr>
+    </w:lvl>
+    <w:lvl w:ilvl="8" w:tplc="40090005" w:tentative="1">
+      <w:start w:val="1"/>
+      <w:numFmt w:val="bullet"/>
+      <w:lvlText w:val=""/>
+      <w:lvlJc w:val="left"/>
+      <w:pPr>
+        <w:ind w:left="6480" w:hanging="360"/>
+      </w:pPr>
+      <w:rPr>
+        <w:rFonts w:ascii="Wingdings" w:hAnsi="Wingdings" w:hint="default"/>
+      </w:rPr>
+    </w:lvl>
+  </w:abstractNum>
   <w:num w:numId="1" w16cid:durableId="2010912759">
     <w:abstractNumId w:val="0"/>
   </w:num>
@@ -2238,6 +2446,9 @@
   </w:num>
   <w:num w:numId="3" w16cid:durableId="944772425">
     <w:abstractNumId w:val="2"/>
+  </w:num>
+  <w:num w:numId="4" w16cid:durableId="225337209">
+    <w:abstractNumId w:val="3"/>
   </w:num>
 </w:numbering>
 </file>

</xml_diff>

<commit_message>
Learn UNIQUE and NOT NULL
</commit_message>
<xml_diff>
--- a/section33_postgreSQL/section33_postgreSQLNotes.docx
+++ b/section33_postgreSQL/section33_postgreSQLNotes.docx
@@ -1974,6 +1974,71 @@
         </w:drawing>
       </w:r>
     </w:p>
+    <w:p>
+      <w:pPr>
+        <w:rPr>
+          <w:rFonts w:ascii="Times New Roman" w:hAnsi="Times New Roman" w:cs="Times New Roman"/>
+          <w:b/>
+          <w:bCs/>
+          <w:sz w:val="28"/>
+          <w:szCs w:val="28"/>
+        </w:rPr>
+      </w:pPr>
+      <w:r>
+        <w:rPr>
+          <w:rFonts w:ascii="Times New Roman" w:hAnsi="Times New Roman" w:cs="Times New Roman"/>
+          <w:b/>
+          <w:bCs/>
+          <w:sz w:val="28"/>
+          <w:szCs w:val="28"/>
+        </w:rPr>
+        <w:t>254. UNIQUE and NOT NULL | Travel Tracker Part 1</w:t>
+      </w:r>
+    </w:p>
+    <w:p>
+      <w:pPr>
+        <w:pStyle w:val="ListParagraph"/>
+        <w:numPr>
+          <w:ilvl w:val="0"/>
+          <w:numId w:val="4"/>
+        </w:numPr>
+        <w:rPr>
+          <w:rFonts w:ascii="Times New Roman" w:hAnsi="Times New Roman" w:cs="Times New Roman"/>
+          <w:sz w:val="28"/>
+          <w:szCs w:val="28"/>
+        </w:rPr>
+      </w:pPr>
+      <w:r>
+        <w:rPr>
+          <w:rFonts w:ascii="Times New Roman" w:hAnsi="Times New Roman" w:cs="Times New Roman"/>
+          <w:sz w:val="28"/>
+          <w:szCs w:val="28"/>
+        </w:rPr>
+        <w:t>NOT NULL – Missing or empty values are not allowed. Attempts to ass NULL will result in an error.</w:t>
+      </w:r>
+    </w:p>
+    <w:p>
+      <w:pPr>
+        <w:pStyle w:val="ListParagraph"/>
+        <w:numPr>
+          <w:ilvl w:val="0"/>
+          <w:numId w:val="4"/>
+        </w:numPr>
+        <w:rPr>
+          <w:rFonts w:ascii="Times New Roman" w:hAnsi="Times New Roman" w:cs="Times New Roman"/>
+          <w:sz w:val="28"/>
+          <w:szCs w:val="28"/>
+        </w:rPr>
+      </w:pPr>
+      <w:r>
+        <w:rPr>
+          <w:rFonts w:ascii="Times New Roman" w:hAnsi="Times New Roman" w:cs="Times New Roman"/>
+          <w:sz w:val="28"/>
+          <w:szCs w:val="28"/>
+        </w:rPr>
+        <w:t>UNIQUE – Value cannot be repeated in the table. No other value stored can be the same (avoids duplicates).</w:t>
+      </w:r>
+    </w:p>
     <w:sectPr>
       <w:pgSz w:w="11906" w:h="16838"/>
       <w:pgMar w:top="720" w:right="720" w:bottom="720" w:left="720" w:header="708" w:footer="708" w:gutter="0"/>
@@ -2328,7 +2393,7 @@
   <w:abstractNum w:abstractNumId="3" w15:restartNumberingAfterBreak="0">
     <w:nsid w:val="62C60005"/>
     <w:multiLevelType w:val="hybridMultilevel"/>
-    <w:tmpl w:val="EDF6A660"/>
+    <w:tmpl w:val="9AD6B190"/>
     <w:lvl w:ilvl="0" w:tplc="40090001">
       <w:start w:val="1"/>
       <w:numFmt w:val="bullet"/>

</xml_diff>

<commit_message>
Learn one to one relationship and inner join
</commit_message>
<xml_diff>
--- a/section33_postgreSQL/section33_postgreSQLNotes.docx
+++ b/section33_postgreSQL/section33_postgreSQLNotes.docx
@@ -130,7 +130,25 @@
           <w:sz w:val="28"/>
           <w:szCs w:val="28"/>
         </w:rPr>
-        <w:t>Advanced Features: Supports advanced data types (JSON, XML, arrays), full-text search, and geospatial data with PostGIS.</w:t>
+        <w:t xml:space="preserve">Advanced Features: Supports advanced data types (JSON, XML, arrays), full-text search, and geospatial data with </w:t>
+      </w:r>
+      <w:proofErr w:type="spellStart"/>
+      <w:r>
+        <w:rPr>
+          <w:rFonts w:ascii="Times New Roman" w:hAnsi="Times New Roman" w:cs="Times New Roman"/>
+          <w:sz w:val="28"/>
+          <w:szCs w:val="28"/>
+        </w:rPr>
+        <w:t>PostGIS</w:t>
+      </w:r>
+      <w:proofErr w:type="spellEnd"/>
+      <w:r>
+        <w:rPr>
+          <w:rFonts w:ascii="Times New Roman" w:hAnsi="Times New Roman" w:cs="Times New Roman"/>
+          <w:sz w:val="28"/>
+          <w:szCs w:val="28"/>
+        </w:rPr>
+        <w:t>.</w:t>
       </w:r>
     </w:p>
     <w:p>
@@ -461,7 +479,33 @@
           <w:lang w:eastAsia="en-IN"/>
           <w14:ligatures w14:val="none"/>
         </w:rPr>
-        <w:t>"pg"</w:t>
+        <w:t>"</w:t>
+      </w:r>
+      <w:proofErr w:type="spellStart"/>
+      <w:r>
+        <w:rPr>
+          <w:rFonts w:ascii="Consolas" w:eastAsia="Times New Roman" w:hAnsi="Consolas" w:cs="Times New Roman"/>
+          <w:color w:val="CE9178"/>
+          <w:kern w:val="0"/>
+          <w:sz w:val="27"/>
+          <w:szCs w:val="27"/>
+          <w:lang w:eastAsia="en-IN"/>
+          <w14:ligatures w14:val="none"/>
+        </w:rPr>
+        <w:t>pg</w:t>
+      </w:r>
+      <w:proofErr w:type="spellEnd"/>
+      <w:r>
+        <w:rPr>
+          <w:rFonts w:ascii="Consolas" w:eastAsia="Times New Roman" w:hAnsi="Consolas" w:cs="Times New Roman"/>
+          <w:color w:val="CE9178"/>
+          <w:kern w:val="0"/>
+          <w:sz w:val="27"/>
+          <w:szCs w:val="27"/>
+          <w:lang w:eastAsia="en-IN"/>
+          <w14:ligatures w14:val="none"/>
+        </w:rPr>
+        <w:t>"</w:t>
       </w:r>
       <w:r>
         <w:rPr>
@@ -490,6 +534,7 @@
           <w14:ligatures w14:val="none"/>
         </w:rPr>
       </w:pPr>
+      <w:proofErr w:type="spellStart"/>
       <w:r>
         <w:rPr>
           <w:rFonts w:ascii="Consolas" w:eastAsia="Times New Roman" w:hAnsi="Consolas" w:cs="Times New Roman"/>
@@ -502,6 +547,7 @@
         </w:rPr>
         <w:t>const</w:t>
       </w:r>
+      <w:proofErr w:type="spellEnd"/>
       <w:r>
         <w:rPr>
           <w:rFonts w:ascii="Consolas" w:eastAsia="Times New Roman" w:hAnsi="Consolas" w:cs="Times New Roman"/>
@@ -821,7 +867,33 @@
           <w:lang w:eastAsia="en-IN"/>
           <w14:ligatures w14:val="none"/>
         </w:rPr>
-        <w:t>"myDatabase"</w:t>
+        <w:t>"</w:t>
+      </w:r>
+      <w:proofErr w:type="spellStart"/>
+      <w:r>
+        <w:rPr>
+          <w:rFonts w:ascii="Consolas" w:eastAsia="Times New Roman" w:hAnsi="Consolas" w:cs="Times New Roman"/>
+          <w:color w:val="CE9178"/>
+          <w:kern w:val="0"/>
+          <w:sz w:val="27"/>
+          <w:szCs w:val="27"/>
+          <w:lang w:eastAsia="en-IN"/>
+          <w14:ligatures w14:val="none"/>
+        </w:rPr>
+        <w:t>myDatabase</w:t>
+      </w:r>
+      <w:proofErr w:type="spellEnd"/>
+      <w:r>
+        <w:rPr>
+          <w:rFonts w:ascii="Consolas" w:eastAsia="Times New Roman" w:hAnsi="Consolas" w:cs="Times New Roman"/>
+          <w:color w:val="CE9178"/>
+          <w:kern w:val="0"/>
+          <w:sz w:val="27"/>
+          <w:szCs w:val="27"/>
+          <w:lang w:eastAsia="en-IN"/>
+          <w14:ligatures w14:val="none"/>
+        </w:rPr>
+        <w:t>"</w:t>
       </w:r>
       <w:r>
         <w:rPr>
@@ -1015,6 +1087,7 @@
           <w14:ligatures w14:val="none"/>
         </w:rPr>
       </w:pPr>
+      <w:proofErr w:type="spellStart"/>
       <w:r>
         <w:rPr>
           <w:rFonts w:ascii="Consolas" w:eastAsia="Times New Roman" w:hAnsi="Consolas" w:cs="Times New Roman"/>
@@ -1051,6 +1124,7 @@
         </w:rPr>
         <w:t>connect</w:t>
       </w:r>
+      <w:proofErr w:type="spellEnd"/>
       <w:r>
         <w:rPr>
           <w:rFonts w:ascii="Consolas" w:eastAsia="Times New Roman" w:hAnsi="Consolas" w:cs="Times New Roman"/>
@@ -1093,6 +1167,7 @@
           <w14:ligatures w14:val="none"/>
         </w:rPr>
       </w:pPr>
+      <w:proofErr w:type="spellStart"/>
       <w:r>
         <w:rPr>
           <w:rFonts w:ascii="Consolas" w:eastAsia="Times New Roman" w:hAnsi="Consolas" w:cs="Times New Roman"/>
@@ -1129,6 +1204,7 @@
         </w:rPr>
         <w:t>query</w:t>
       </w:r>
+      <w:proofErr w:type="spellEnd"/>
       <w:r>
         <w:rPr>
           <w:rFonts w:ascii="Consolas" w:eastAsia="Times New Roman" w:hAnsi="Consolas" w:cs="Times New Roman"/>
@@ -1312,6 +1388,7 @@
         </w:rPr>
         <w:t xml:space="preserve">) </w:t>
       </w:r>
+      <w:proofErr w:type="spellStart"/>
       <w:r>
         <w:rPr>
           <w:rFonts w:ascii="Consolas" w:eastAsia="Times New Roman" w:hAnsi="Consolas" w:cs="Times New Roman"/>
@@ -1348,6 +1425,7 @@
         </w:rPr>
         <w:t>error</w:t>
       </w:r>
+      <w:proofErr w:type="spellEnd"/>
       <w:r>
         <w:rPr>
           <w:rFonts w:ascii="Consolas" w:eastAsia="Times New Roman" w:hAnsi="Consolas" w:cs="Times New Roman"/>
@@ -1384,6 +1462,7 @@
         </w:rPr>
         <w:t xml:space="preserve">, </w:t>
       </w:r>
+      <w:proofErr w:type="spellStart"/>
       <w:r>
         <w:rPr>
           <w:rFonts w:ascii="Consolas" w:eastAsia="Times New Roman" w:hAnsi="Consolas" w:cs="Times New Roman"/>
@@ -1420,6 +1499,7 @@
         </w:rPr>
         <w:t>stack</w:t>
       </w:r>
+      <w:proofErr w:type="spellEnd"/>
       <w:r>
         <w:rPr>
           <w:rFonts w:ascii="Consolas" w:eastAsia="Times New Roman" w:hAnsi="Consolas" w:cs="Times New Roman"/>
@@ -1555,6 +1635,7 @@
         </w:rPr>
         <w:t xml:space="preserve">, </w:t>
       </w:r>
+      <w:proofErr w:type="spellStart"/>
       <w:r>
         <w:rPr>
           <w:rFonts w:ascii="Consolas" w:eastAsia="Times New Roman" w:hAnsi="Consolas" w:cs="Times New Roman"/>
@@ -1591,6 +1672,7 @@
         </w:rPr>
         <w:t>rows</w:t>
       </w:r>
+      <w:proofErr w:type="spellEnd"/>
       <w:r>
         <w:rPr>
           <w:rFonts w:ascii="Consolas" w:eastAsia="Times New Roman" w:hAnsi="Consolas" w:cs="Times New Roman"/>
@@ -1630,6 +1712,7 @@
         </w:rPr>
         <w:t xml:space="preserve">    </w:t>
       </w:r>
+      <w:proofErr w:type="spellStart"/>
       <w:r>
         <w:rPr>
           <w:rFonts w:ascii="Consolas" w:eastAsia="Times New Roman" w:hAnsi="Consolas" w:cs="Times New Roman"/>
@@ -1666,6 +1749,7 @@
         </w:rPr>
         <w:t>end</w:t>
       </w:r>
+      <w:proofErr w:type="spellEnd"/>
       <w:r>
         <w:rPr>
           <w:rFonts w:ascii="Consolas" w:eastAsia="Times New Roman" w:hAnsi="Consolas" w:cs="Times New Roman"/>
@@ -1727,7 +1811,43 @@
           <w:sz w:val="28"/>
           <w:szCs w:val="28"/>
         </w:rPr>
-        <w:t>Package name: `pg` (node-postgres).</w:t>
+        <w:t>Package name: `</w:t>
+      </w:r>
+      <w:proofErr w:type="spellStart"/>
+      <w:r>
+        <w:rPr>
+          <w:rFonts w:ascii="Times New Roman" w:hAnsi="Times New Roman" w:cs="Times New Roman"/>
+          <w:sz w:val="28"/>
+          <w:szCs w:val="28"/>
+        </w:rPr>
+        <w:t>pg</w:t>
+      </w:r>
+      <w:proofErr w:type="spellEnd"/>
+      <w:r>
+        <w:rPr>
+          <w:rFonts w:ascii="Times New Roman" w:hAnsi="Times New Roman" w:cs="Times New Roman"/>
+          <w:sz w:val="28"/>
+          <w:szCs w:val="28"/>
+        </w:rPr>
+        <w:t>` (node-</w:t>
+      </w:r>
+      <w:proofErr w:type="spellStart"/>
+      <w:r>
+        <w:rPr>
+          <w:rFonts w:ascii="Times New Roman" w:hAnsi="Times New Roman" w:cs="Times New Roman"/>
+          <w:sz w:val="28"/>
+          <w:szCs w:val="28"/>
+        </w:rPr>
+        <w:t>postgres</w:t>
+      </w:r>
+      <w:proofErr w:type="spellEnd"/>
+      <w:r>
+        <w:rPr>
+          <w:rFonts w:ascii="Times New Roman" w:hAnsi="Times New Roman" w:cs="Times New Roman"/>
+          <w:sz w:val="28"/>
+          <w:szCs w:val="28"/>
+        </w:rPr>
+        <w:t>).</w:t>
       </w:r>
     </w:p>
     <w:p>
@@ -1934,6 +2054,7 @@
       <w:r>
         <w:rPr>
           <w:rFonts w:ascii="Times New Roman" w:hAnsi="Times New Roman" w:cs="Times New Roman"/>
+          <w:noProof/>
           <w:sz w:val="28"/>
           <w:szCs w:val="28"/>
         </w:rPr>
@@ -2039,6 +2160,485 @@
         <w:t>UNIQUE – Value cannot be repeated in the table. No other value stored can be the same (avoids duplicates).</w:t>
       </w:r>
     </w:p>
+    <w:p>
+      <w:pPr>
+        <w:rPr>
+          <w:rFonts w:ascii="Times New Roman" w:hAnsi="Times New Roman" w:cs="Times New Roman"/>
+          <w:b/>
+          <w:bCs/>
+          <w:sz w:val="28"/>
+          <w:szCs w:val="28"/>
+        </w:rPr>
+      </w:pPr>
+      <w:r>
+        <w:rPr>
+          <w:rFonts w:ascii="Times New Roman" w:hAnsi="Times New Roman" w:cs="Times New Roman"/>
+          <w:b/>
+          <w:bCs/>
+          <w:sz w:val="28"/>
+          <w:szCs w:val="28"/>
+        </w:rPr>
+        <w:t>255. INSERT and add Data | Travel Tracker Part 2</w:t>
+      </w:r>
+    </w:p>
+    <w:p>
+      <w:pPr>
+        <w:shd w:val="clear" w:color="auto" w:fill="1F1F1F"/>
+        <w:spacing w:after="0" w:line="360" w:lineRule="atLeast"/>
+        <w:rPr>
+          <w:rFonts w:ascii="Consolas" w:eastAsia="Times New Roman" w:hAnsi="Consolas" w:cs="Times New Roman"/>
+          <w:color w:val="CCCCCC"/>
+          <w:kern w:val="0"/>
+          <w:sz w:val="27"/>
+          <w:szCs w:val="27"/>
+          <w:lang w:eastAsia="en-IN"/>
+          <w14:ligatures w14:val="none"/>
+        </w:rPr>
+      </w:pPr>
+      <w:r>
+        <w:rPr>
+          <w:rFonts w:ascii="Consolas" w:eastAsia="Times New Roman" w:hAnsi="Consolas" w:cs="Times New Roman"/>
+          <w:color w:val="C586C0"/>
+          <w:kern w:val="0"/>
+          <w:sz w:val="27"/>
+          <w:szCs w:val="27"/>
+          <w:lang w:eastAsia="en-IN"/>
+          <w14:ligatures w14:val="none"/>
+        </w:rPr>
+        <w:t>await</w:t>
+      </w:r>
+      <w:r>
+        <w:rPr>
+          <w:rFonts w:ascii="Consolas" w:eastAsia="Times New Roman" w:hAnsi="Consolas" w:cs="Times New Roman"/>
+          <w:color w:val="CCCCCC"/>
+          <w:kern w:val="0"/>
+          <w:sz w:val="27"/>
+          <w:szCs w:val="27"/>
+          <w:lang w:eastAsia="en-IN"/>
+          <w14:ligatures w14:val="none"/>
+        </w:rPr>
+        <w:t xml:space="preserve"> </w:t>
+      </w:r>
+      <w:proofErr w:type="spellStart"/>
+      <w:r>
+        <w:rPr>
+          <w:rFonts w:ascii="Consolas" w:eastAsia="Times New Roman" w:hAnsi="Consolas" w:cs="Times New Roman"/>
+          <w:color w:val="4FC1FF"/>
+          <w:kern w:val="0"/>
+          <w:sz w:val="27"/>
+          <w:szCs w:val="27"/>
+          <w:lang w:eastAsia="en-IN"/>
+          <w14:ligatures w14:val="none"/>
+        </w:rPr>
+        <w:t>DB</w:t>
+      </w:r>
+      <w:r>
+        <w:rPr>
+          <w:rFonts w:ascii="Consolas" w:eastAsia="Times New Roman" w:hAnsi="Consolas" w:cs="Times New Roman"/>
+          <w:color w:val="CCCCCC"/>
+          <w:kern w:val="0"/>
+          <w:sz w:val="27"/>
+          <w:szCs w:val="27"/>
+          <w:lang w:eastAsia="en-IN"/>
+          <w14:ligatures w14:val="none"/>
+        </w:rPr>
+        <w:t>.</w:t>
+      </w:r>
+      <w:r>
+        <w:rPr>
+          <w:rFonts w:ascii="Consolas" w:eastAsia="Times New Roman" w:hAnsi="Consolas" w:cs="Times New Roman"/>
+          <w:color w:val="DCDCAA"/>
+          <w:kern w:val="0"/>
+          <w:sz w:val="27"/>
+          <w:szCs w:val="27"/>
+          <w:lang w:eastAsia="en-IN"/>
+          <w14:ligatures w14:val="none"/>
+        </w:rPr>
+        <w:t>query</w:t>
+      </w:r>
+      <w:proofErr w:type="spellEnd"/>
+      <w:r>
+        <w:rPr>
+          <w:rFonts w:ascii="Consolas" w:eastAsia="Times New Roman" w:hAnsi="Consolas" w:cs="Times New Roman"/>
+          <w:color w:val="CCCCCC"/>
+          <w:kern w:val="0"/>
+          <w:sz w:val="27"/>
+          <w:szCs w:val="27"/>
+          <w:lang w:eastAsia="en-IN"/>
+          <w14:ligatures w14:val="none"/>
+        </w:rPr>
+        <w:t>(</w:t>
+      </w:r>
+    </w:p>
+    <w:p>
+      <w:pPr>
+        <w:shd w:val="clear" w:color="auto" w:fill="1F1F1F"/>
+        <w:spacing w:after="0" w:line="360" w:lineRule="atLeast"/>
+        <w:rPr>
+          <w:rFonts w:ascii="Consolas" w:eastAsia="Times New Roman" w:hAnsi="Consolas" w:cs="Times New Roman"/>
+          <w:color w:val="CCCCCC"/>
+          <w:kern w:val="0"/>
+          <w:sz w:val="27"/>
+          <w:szCs w:val="27"/>
+          <w:lang w:eastAsia="en-IN"/>
+          <w14:ligatures w14:val="none"/>
+        </w:rPr>
+      </w:pPr>
+      <w:r>
+        <w:rPr>
+          <w:rFonts w:ascii="Consolas" w:eastAsia="Times New Roman" w:hAnsi="Consolas" w:cs="Times New Roman"/>
+          <w:color w:val="CCCCCC"/>
+          <w:kern w:val="0"/>
+          <w:sz w:val="27"/>
+          <w:szCs w:val="27"/>
+          <w:lang w:eastAsia="en-IN"/>
+          <w14:ligatures w14:val="none"/>
+        </w:rPr>
+        <w:t xml:space="preserve">    </w:t>
+      </w:r>
+      <w:r>
+        <w:rPr>
+          <w:rFonts w:ascii="Consolas" w:eastAsia="Times New Roman" w:hAnsi="Consolas" w:cs="Times New Roman"/>
+          <w:color w:val="CE9178"/>
+          <w:kern w:val="0"/>
+          <w:sz w:val="27"/>
+          <w:szCs w:val="27"/>
+          <w:lang w:eastAsia="en-IN"/>
+          <w14:ligatures w14:val="none"/>
+        </w:rPr>
+        <w:t xml:space="preserve">"INSERT INTO </w:t>
+      </w:r>
+      <w:proofErr w:type="spellStart"/>
+      <w:r>
+        <w:rPr>
+          <w:rFonts w:ascii="Consolas" w:eastAsia="Times New Roman" w:hAnsi="Consolas" w:cs="Times New Roman"/>
+          <w:color w:val="CE9178"/>
+          <w:kern w:val="0"/>
+          <w:sz w:val="27"/>
+          <w:szCs w:val="27"/>
+          <w:lang w:eastAsia="en-IN"/>
+          <w14:ligatures w14:val="none"/>
+        </w:rPr>
+        <w:t>visited_countries</w:t>
+      </w:r>
+      <w:proofErr w:type="spellEnd"/>
+      <w:r>
+        <w:rPr>
+          <w:rFonts w:ascii="Consolas" w:eastAsia="Times New Roman" w:hAnsi="Consolas" w:cs="Times New Roman"/>
+          <w:color w:val="CE9178"/>
+          <w:kern w:val="0"/>
+          <w:sz w:val="27"/>
+          <w:szCs w:val="27"/>
+          <w:lang w:eastAsia="en-IN"/>
+          <w14:ligatures w14:val="none"/>
+        </w:rPr>
+        <w:t xml:space="preserve"> (</w:t>
+      </w:r>
+      <w:proofErr w:type="spellStart"/>
+      <w:r>
+        <w:rPr>
+          <w:rFonts w:ascii="Consolas" w:eastAsia="Times New Roman" w:hAnsi="Consolas" w:cs="Times New Roman"/>
+          <w:color w:val="CE9178"/>
+          <w:kern w:val="0"/>
+          <w:sz w:val="27"/>
+          <w:szCs w:val="27"/>
+          <w:lang w:eastAsia="en-IN"/>
+          <w14:ligatures w14:val="none"/>
+        </w:rPr>
+        <w:t>country_code</w:t>
+      </w:r>
+      <w:proofErr w:type="spellEnd"/>
+      <w:r>
+        <w:rPr>
+          <w:rFonts w:ascii="Consolas" w:eastAsia="Times New Roman" w:hAnsi="Consolas" w:cs="Times New Roman"/>
+          <w:color w:val="CE9178"/>
+          <w:kern w:val="0"/>
+          <w:sz w:val="27"/>
+          <w:szCs w:val="27"/>
+          <w:lang w:eastAsia="en-IN"/>
+          <w14:ligatures w14:val="none"/>
+        </w:rPr>
+        <w:t>) VALUES ($1)"</w:t>
+      </w:r>
+      <w:r>
+        <w:rPr>
+          <w:rFonts w:ascii="Consolas" w:eastAsia="Times New Roman" w:hAnsi="Consolas" w:cs="Times New Roman"/>
+          <w:color w:val="CCCCCC"/>
+          <w:kern w:val="0"/>
+          <w:sz w:val="27"/>
+          <w:szCs w:val="27"/>
+          <w:lang w:eastAsia="en-IN"/>
+          <w14:ligatures w14:val="none"/>
+        </w:rPr>
+        <w:t>,</w:t>
+      </w:r>
+    </w:p>
+    <w:p>
+      <w:pPr>
+        <w:shd w:val="clear" w:color="auto" w:fill="1F1F1F"/>
+        <w:spacing w:after="0" w:line="360" w:lineRule="atLeast"/>
+        <w:rPr>
+          <w:rFonts w:ascii="Consolas" w:eastAsia="Times New Roman" w:hAnsi="Consolas" w:cs="Times New Roman"/>
+          <w:color w:val="CCCCCC"/>
+          <w:kern w:val="0"/>
+          <w:sz w:val="27"/>
+          <w:szCs w:val="27"/>
+          <w:lang w:eastAsia="en-IN"/>
+          <w14:ligatures w14:val="none"/>
+        </w:rPr>
+      </w:pPr>
+      <w:r>
+        <w:rPr>
+          <w:rFonts w:ascii="Consolas" w:eastAsia="Times New Roman" w:hAnsi="Consolas" w:cs="Times New Roman"/>
+          <w:color w:val="CCCCCC"/>
+          <w:kern w:val="0"/>
+          <w:sz w:val="27"/>
+          <w:szCs w:val="27"/>
+          <w:lang w:eastAsia="en-IN"/>
+          <w14:ligatures w14:val="none"/>
+        </w:rPr>
+        <w:t>    [</w:t>
+      </w:r>
+      <w:proofErr w:type="spellStart"/>
+      <w:r>
+        <w:rPr>
+          <w:rFonts w:ascii="Consolas" w:eastAsia="Times New Roman" w:hAnsi="Consolas" w:cs="Times New Roman"/>
+          <w:color w:val="4FC1FF"/>
+          <w:kern w:val="0"/>
+          <w:sz w:val="27"/>
+          <w:szCs w:val="27"/>
+          <w:lang w:eastAsia="en-IN"/>
+          <w14:ligatures w14:val="none"/>
+        </w:rPr>
+        <w:t>countryCode</w:t>
+      </w:r>
+      <w:proofErr w:type="spellEnd"/>
+      <w:r>
+        <w:rPr>
+          <w:rFonts w:ascii="Consolas" w:eastAsia="Times New Roman" w:hAnsi="Consolas" w:cs="Times New Roman"/>
+          <w:color w:val="CCCCCC"/>
+          <w:kern w:val="0"/>
+          <w:sz w:val="27"/>
+          <w:szCs w:val="27"/>
+          <w:lang w:eastAsia="en-IN"/>
+          <w14:ligatures w14:val="none"/>
+        </w:rPr>
+        <w:t>]</w:t>
+      </w:r>
+    </w:p>
+    <w:p>
+      <w:pPr>
+        <w:shd w:val="clear" w:color="auto" w:fill="1F1F1F"/>
+        <w:spacing w:after="0" w:line="360" w:lineRule="atLeast"/>
+        <w:rPr>
+          <w:rFonts w:ascii="Consolas" w:eastAsia="Times New Roman" w:hAnsi="Consolas" w:cs="Times New Roman"/>
+          <w:color w:val="CCCCCC"/>
+          <w:kern w:val="0"/>
+          <w:sz w:val="27"/>
+          <w:szCs w:val="27"/>
+          <w:lang w:eastAsia="en-IN"/>
+          <w14:ligatures w14:val="none"/>
+        </w:rPr>
+      </w:pPr>
+      <w:r>
+        <w:rPr>
+          <w:rFonts w:ascii="Consolas" w:eastAsia="Times New Roman" w:hAnsi="Consolas" w:cs="Times New Roman"/>
+          <w:color w:val="CCCCCC"/>
+          <w:kern w:val="0"/>
+          <w:sz w:val="27"/>
+          <w:szCs w:val="27"/>
+          <w:lang w:eastAsia="en-IN"/>
+          <w14:ligatures w14:val="none"/>
+        </w:rPr>
+        <w:t>);</w:t>
+      </w:r>
+    </w:p>
+    <w:p>
+      <w:pPr>
+        <w:rPr>
+          <w:rFonts w:ascii="Times New Roman" w:hAnsi="Times New Roman" w:cs="Times New Roman"/>
+          <w:sz w:val="28"/>
+          <w:szCs w:val="28"/>
+        </w:rPr>
+      </w:pPr>
+    </w:p>
+    <w:p>
+      <w:pPr>
+        <w:rPr>
+          <w:rFonts w:ascii="Times New Roman" w:hAnsi="Times New Roman" w:cs="Times New Roman"/>
+          <w:b/>
+          <w:bCs/>
+          <w:sz w:val="28"/>
+          <w:szCs w:val="28"/>
+        </w:rPr>
+      </w:pPr>
+      <w:r>
+        <w:rPr>
+          <w:rFonts w:ascii="Times New Roman" w:hAnsi="Times New Roman" w:cs="Times New Roman"/>
+          <w:b/>
+          <w:bCs/>
+          <w:sz w:val="28"/>
+          <w:szCs w:val="28"/>
+        </w:rPr>
+        <w:t>257. One to One Relationships and Inner Joins</w:t>
+      </w:r>
+    </w:p>
+    <w:p>
+      <w:pPr>
+        <w:rPr>
+          <w:rFonts w:ascii="Times New Roman" w:hAnsi="Times New Roman" w:cs="Times New Roman"/>
+          <w:sz w:val="28"/>
+          <w:szCs w:val="28"/>
+        </w:rPr>
+      </w:pPr>
+      <w:r>
+        <w:rPr>
+          <w:rFonts w:ascii="Times New Roman" w:hAnsi="Times New Roman" w:cs="Times New Roman"/>
+          <w:sz w:val="28"/>
+          <w:szCs w:val="28"/>
+        </w:rPr>
+        <w:drawing>
+          <wp:inline distT="0" distB="0" distL="0" distR="0" wp14:anchorId="42351859" wp14:editId="7A781823">
+            <wp:extent cx="3327400" cy="1552787"/>
+            <wp:effectExtent l="0" t="0" r="6350" b="9525"/>
+            <wp:docPr id="70745886" name="Picture 1"/>
+            <wp:cNvGraphicFramePr>
+              <a:graphicFrameLocks xmlns:a="http://schemas.openxmlformats.org/drawingml/2006/main" noChangeAspect="1"/>
+            </wp:cNvGraphicFramePr>
+            <a:graphic xmlns:a="http://schemas.openxmlformats.org/drawingml/2006/main">
+              <a:graphicData uri="http://schemas.openxmlformats.org/drawingml/2006/picture">
+                <pic:pic xmlns:pic="http://schemas.openxmlformats.org/drawingml/2006/picture">
+                  <pic:nvPicPr>
+                    <pic:cNvPr id="70745886" name=""/>
+                    <pic:cNvPicPr/>
+                  </pic:nvPicPr>
+                  <pic:blipFill>
+                    <a:blip r:embed="rId7"/>
+                    <a:stretch>
+                      <a:fillRect/>
+                    </a:stretch>
+                  </pic:blipFill>
+                  <pic:spPr>
+                    <a:xfrm>
+                      <a:off x="0" y="0"/>
+                      <a:ext cx="3363654" cy="1569705"/>
+                    </a:xfrm>
+                    <a:prstGeom prst="rect">
+                      <a:avLst/>
+                    </a:prstGeom>
+                  </pic:spPr>
+                </pic:pic>
+              </a:graphicData>
+            </a:graphic>
+          </wp:inline>
+        </w:drawing>
+      </w:r>
+    </w:p>
+    <w:p>
+      <w:pPr>
+        <w:pStyle w:val="ListParagraph"/>
+        <w:numPr>
+          <w:ilvl w:val="0"/>
+          <w:numId w:val="7"/>
+        </w:numPr>
+        <w:rPr>
+          <w:rFonts w:ascii="Times New Roman" w:hAnsi="Times New Roman" w:cs="Times New Roman"/>
+          <w:sz w:val="28"/>
+          <w:szCs w:val="28"/>
+        </w:rPr>
+      </w:pPr>
+      <w:r>
+        <w:rPr>
+          <w:rFonts w:ascii="Times New Roman" w:hAnsi="Times New Roman" w:cs="Times New Roman"/>
+          <w:sz w:val="28"/>
+          <w:szCs w:val="28"/>
+        </w:rPr>
+        <w:t>Example of one-to-one relationship.</w:t>
+      </w:r>
+    </w:p>
+    <w:p>
+      <w:pPr>
+        <w:rPr>
+          <w:rFonts w:ascii="Times New Roman" w:hAnsi="Times New Roman" w:cs="Times New Roman"/>
+          <w:sz w:val="28"/>
+          <w:szCs w:val="28"/>
+        </w:rPr>
+      </w:pPr>
+      <w:r>
+        <w:rPr>
+          <w:rFonts w:ascii="Times New Roman" w:hAnsi="Times New Roman" w:cs="Times New Roman"/>
+          <w:sz w:val="28"/>
+          <w:szCs w:val="28"/>
+        </w:rPr>
+        <w:lastRenderedPageBreak/>
+        <w:drawing>
+          <wp:inline distT="0" distB="0" distL="0" distR="0" wp14:anchorId="7012853D" wp14:editId="118E6901">
+            <wp:extent cx="3473629" cy="1016052"/>
+            <wp:effectExtent l="0" t="0" r="0" b="0"/>
+            <wp:docPr id="666394215" name="Picture 1"/>
+            <wp:cNvGraphicFramePr>
+              <a:graphicFrameLocks xmlns:a="http://schemas.openxmlformats.org/drawingml/2006/main" noChangeAspect="1"/>
+            </wp:cNvGraphicFramePr>
+            <a:graphic xmlns:a="http://schemas.openxmlformats.org/drawingml/2006/main">
+              <a:graphicData uri="http://schemas.openxmlformats.org/drawingml/2006/picture">
+                <pic:pic xmlns:pic="http://schemas.openxmlformats.org/drawingml/2006/picture">
+                  <pic:nvPicPr>
+                    <pic:cNvPr id="666394215" name=""/>
+                    <pic:cNvPicPr/>
+                  </pic:nvPicPr>
+                  <pic:blipFill>
+                    <a:blip r:embed="rId8"/>
+                    <a:stretch>
+                      <a:fillRect/>
+                    </a:stretch>
+                  </pic:blipFill>
+                  <pic:spPr>
+                    <a:xfrm>
+                      <a:off x="0" y="0"/>
+                      <a:ext cx="3473629" cy="1016052"/>
+                    </a:xfrm>
+                    <a:prstGeom prst="rect">
+                      <a:avLst/>
+                    </a:prstGeom>
+                  </pic:spPr>
+                </pic:pic>
+              </a:graphicData>
+            </a:graphic>
+          </wp:inline>
+        </w:drawing>
+      </w:r>
+    </w:p>
+    <w:p>
+      <w:pPr>
+        <w:pStyle w:val="ListParagraph"/>
+        <w:numPr>
+          <w:ilvl w:val="0"/>
+          <w:numId w:val="7"/>
+        </w:numPr>
+        <w:rPr>
+          <w:rFonts w:ascii="Times New Roman" w:hAnsi="Times New Roman" w:cs="Times New Roman"/>
+          <w:sz w:val="28"/>
+          <w:szCs w:val="28"/>
+        </w:rPr>
+      </w:pPr>
+      <w:r>
+        <w:rPr>
+          <w:rFonts w:ascii="Times New Roman" w:hAnsi="Times New Roman" w:cs="Times New Roman"/>
+          <w:sz w:val="28"/>
+          <w:szCs w:val="28"/>
+        </w:rPr>
+        <w:t>Inner join</w:t>
+      </w:r>
+    </w:p>
+    <w:p>
+      <w:pPr>
+        <w:rPr>
+          <w:rFonts w:ascii="Times New Roman" w:hAnsi="Times New Roman" w:cs="Times New Roman"/>
+          <w:sz w:val="28"/>
+          <w:szCs w:val="28"/>
+        </w:rPr>
+      </w:pPr>
+    </w:p>
     <w:sectPr>
       <w:pgSz w:w="11906" w:h="16838"/>
       <w:pgMar w:top="720" w:right="720" w:bottom="720" w:left="720" w:header="708" w:footer="708" w:gutter="0"/>
@@ -2052,6 +2652,119 @@
 <file path=word/numbering.xml><?xml version="1.0" encoding="utf-8"?>
 <w:numbering xmlns:wpc="http://schemas.microsoft.com/office/word/2010/wordprocessingCanvas" xmlns:cx="http://schemas.microsoft.com/office/drawing/2014/chartex" xmlns:cx1="http://schemas.microsoft.com/office/drawing/2015/9/8/chartex" xmlns:cx2="http://schemas.microsoft.com/office/drawing/2015/10/21/chartex" xmlns:cx3="http://schemas.microsoft.com/office/drawing/2016/5/9/chartex" xmlns:cx4="http://schemas.microsoft.com/office/drawing/2016/5/10/chartex" xmlns:cx5="http://schemas.microsoft.com/office/drawing/2016/5/11/chartex" xmlns:cx6="http://schemas.microsoft.com/office/drawing/2016/5/12/chartex" xmlns:cx7="http://schemas.microsoft.com/office/drawing/2016/5/13/chartex" xmlns:cx8="http://schemas.microsoft.com/office/drawing/2016/5/14/chartex" xmlns:mc="http://schemas.openxmlformats.org/markup-compatibility/2006" xmlns:aink="http://schemas.microsoft.com/office/drawing/2016/ink" xmlns:am3d="http://schemas.microsoft.com/office/drawing/2017/model3d" xmlns:o="urn:schemas-microsoft-com:office:office" xmlns:oel="http://schemas.microsoft.com/office/2019/extlst" xmlns:r="http://schemas.openxmlformats.org/officeDocument/2006/relationships" xmlns:m="http://schemas.openxmlformats.org/officeDocument/2006/math" xmlns:v="urn:schemas-microsoft-com:vml" xmlns:wp14="http://schemas.microsoft.com/office/word/2010/wordprocessingDrawing" xmlns:wp="http://schemas.openxmlformats.org/drawingml/2006/wordprocessingDrawing" xmlns:w10="urn:schemas-microsoft-com:office:word" xmlns:w="http://schemas.openxmlformats.org/wordprocessingml/2006/main" xmlns:w14="http://schemas.microsoft.com/office/word/2010/wordml" xmlns:w15="http://schemas.microsoft.com/office/word/2012/wordml" xmlns:w16cex="http://schemas.microsoft.com/office/word/2018/wordml/cex" xmlns:w16cid="http://schemas.microsoft.com/office/word/2016/wordml/cid" xmlns:w16="http://schemas.microsoft.com/office/word/2018/wordml" xmlns:w16du="http://schemas.microsoft.com/office/word/2023/wordml/word16du" xmlns:w16sdtdh="http://schemas.microsoft.com/office/word/2020/wordml/sdtdatahash" xmlns:w16se="http://schemas.microsoft.com/office/word/2015/wordml/symex" xmlns:wpg="http://schemas.microsoft.com/office/word/2010/wordprocessingGroup" xmlns:wpi="http://schemas.microsoft.com/office/word/2010/wordprocessingInk" xmlns:wne="http://schemas.microsoft.com/office/word/2006/wordml" xmlns:wps="http://schemas.microsoft.com/office/word/2010/wordprocessingShape" mc:Ignorable="w14 w15 w16se w16cid w16 w16cex w16sdtdh w16du wp14">
   <w:abstractNum w:abstractNumId="0" w15:restartNumberingAfterBreak="0">
+    <w:nsid w:val="010F485B"/>
+    <w:multiLevelType w:val="hybridMultilevel"/>
+    <w:tmpl w:val="BF3846C8"/>
+    <w:lvl w:ilvl="0" w:tplc="40090001">
+      <w:start w:val="1"/>
+      <w:numFmt w:val="bullet"/>
+      <w:lvlText w:val=""/>
+      <w:lvlJc w:val="left"/>
+      <w:pPr>
+        <w:ind w:left="720" w:hanging="360"/>
+      </w:pPr>
+      <w:rPr>
+        <w:rFonts w:ascii="Symbol" w:hAnsi="Symbol" w:hint="default"/>
+      </w:rPr>
+    </w:lvl>
+    <w:lvl w:ilvl="1" w:tplc="40090003" w:tentative="1">
+      <w:start w:val="1"/>
+      <w:numFmt w:val="bullet"/>
+      <w:lvlText w:val="o"/>
+      <w:lvlJc w:val="left"/>
+      <w:pPr>
+        <w:ind w:left="1440" w:hanging="360"/>
+      </w:pPr>
+      <w:rPr>
+        <w:rFonts w:ascii="Courier New" w:hAnsi="Courier New" w:cs="Courier New" w:hint="default"/>
+      </w:rPr>
+    </w:lvl>
+    <w:lvl w:ilvl="2" w:tplc="40090005" w:tentative="1">
+      <w:start w:val="1"/>
+      <w:numFmt w:val="bullet"/>
+      <w:lvlText w:val=""/>
+      <w:lvlJc w:val="left"/>
+      <w:pPr>
+        <w:ind w:left="2160" w:hanging="360"/>
+      </w:pPr>
+      <w:rPr>
+        <w:rFonts w:ascii="Wingdings" w:hAnsi="Wingdings" w:hint="default"/>
+      </w:rPr>
+    </w:lvl>
+    <w:lvl w:ilvl="3" w:tplc="40090001" w:tentative="1">
+      <w:start w:val="1"/>
+      <w:numFmt w:val="bullet"/>
+      <w:lvlText w:val=""/>
+      <w:lvlJc w:val="left"/>
+      <w:pPr>
+        <w:ind w:left="2880" w:hanging="360"/>
+      </w:pPr>
+      <w:rPr>
+        <w:rFonts w:ascii="Symbol" w:hAnsi="Symbol" w:hint="default"/>
+      </w:rPr>
+    </w:lvl>
+    <w:lvl w:ilvl="4" w:tplc="40090003" w:tentative="1">
+      <w:start w:val="1"/>
+      <w:numFmt w:val="bullet"/>
+      <w:lvlText w:val="o"/>
+      <w:lvlJc w:val="left"/>
+      <w:pPr>
+        <w:ind w:left="3600" w:hanging="360"/>
+      </w:pPr>
+      <w:rPr>
+        <w:rFonts w:ascii="Courier New" w:hAnsi="Courier New" w:cs="Courier New" w:hint="default"/>
+      </w:rPr>
+    </w:lvl>
+    <w:lvl w:ilvl="5" w:tplc="40090005" w:tentative="1">
+      <w:start w:val="1"/>
+      <w:numFmt w:val="bullet"/>
+      <w:lvlText w:val=""/>
+      <w:lvlJc w:val="left"/>
+      <w:pPr>
+        <w:ind w:left="4320" w:hanging="360"/>
+      </w:pPr>
+      <w:rPr>
+        <w:rFonts w:ascii="Wingdings" w:hAnsi="Wingdings" w:hint="default"/>
+      </w:rPr>
+    </w:lvl>
+    <w:lvl w:ilvl="6" w:tplc="40090001" w:tentative="1">
+      <w:start w:val="1"/>
+      <w:numFmt w:val="bullet"/>
+      <w:lvlText w:val=""/>
+      <w:lvlJc w:val="left"/>
+      <w:pPr>
+        <w:ind w:left="5040" w:hanging="360"/>
+      </w:pPr>
+      <w:rPr>
+        <w:rFonts w:ascii="Symbol" w:hAnsi="Symbol" w:hint="default"/>
+      </w:rPr>
+    </w:lvl>
+    <w:lvl w:ilvl="7" w:tplc="40090003" w:tentative="1">
+      <w:start w:val="1"/>
+      <w:numFmt w:val="bullet"/>
+      <w:lvlText w:val="o"/>
+      <w:lvlJc w:val="left"/>
+      <w:pPr>
+        <w:ind w:left="5760" w:hanging="360"/>
+      </w:pPr>
+      <w:rPr>
+        <w:rFonts w:ascii="Courier New" w:hAnsi="Courier New" w:cs="Courier New" w:hint="default"/>
+      </w:rPr>
+    </w:lvl>
+    <w:lvl w:ilvl="8" w:tplc="40090005" w:tentative="1">
+      <w:start w:val="1"/>
+      <w:numFmt w:val="bullet"/>
+      <w:lvlText w:val=""/>
+      <w:lvlJc w:val="left"/>
+      <w:pPr>
+        <w:ind w:left="6480" w:hanging="360"/>
+      </w:pPr>
+      <w:rPr>
+        <w:rFonts w:ascii="Wingdings" w:hAnsi="Wingdings" w:hint="default"/>
+      </w:rPr>
+    </w:lvl>
+  </w:abstractNum>
+  <w:abstractNum w:abstractNumId="1" w15:restartNumberingAfterBreak="0">
     <w:nsid w:val="034A5796"/>
     <w:multiLevelType w:val="hybridMultilevel"/>
     <w:tmpl w:val="CB063338"/>
@@ -2164,7 +2877,7 @@
       </w:rPr>
     </w:lvl>
   </w:abstractNum>
-  <w:abstractNum w:abstractNumId="1" w15:restartNumberingAfterBreak="0">
+  <w:abstractNum w:abstractNumId="2" w15:restartNumberingAfterBreak="0">
     <w:nsid w:val="07DC28CA"/>
     <w:multiLevelType w:val="multilevel"/>
     <w:tmpl w:val="278EC5F8"/>
@@ -2277,7 +2990,120 @@
       </w:pPr>
     </w:lvl>
   </w:abstractNum>
-  <w:abstractNum w:abstractNumId="2" w15:restartNumberingAfterBreak="0">
+  <w:abstractNum w:abstractNumId="3" w15:restartNumberingAfterBreak="0">
+    <w:nsid w:val="16684F44"/>
+    <w:multiLevelType w:val="hybridMultilevel"/>
+    <w:tmpl w:val="44165976"/>
+    <w:lvl w:ilvl="0" w:tplc="40090001">
+      <w:start w:val="1"/>
+      <w:numFmt w:val="bullet"/>
+      <w:lvlText w:val=""/>
+      <w:lvlJc w:val="left"/>
+      <w:pPr>
+        <w:ind w:left="720" w:hanging="360"/>
+      </w:pPr>
+      <w:rPr>
+        <w:rFonts w:ascii="Symbol" w:hAnsi="Symbol" w:hint="default"/>
+      </w:rPr>
+    </w:lvl>
+    <w:lvl w:ilvl="1" w:tplc="40090003" w:tentative="1">
+      <w:start w:val="1"/>
+      <w:numFmt w:val="bullet"/>
+      <w:lvlText w:val="o"/>
+      <w:lvlJc w:val="left"/>
+      <w:pPr>
+        <w:ind w:left="1440" w:hanging="360"/>
+      </w:pPr>
+      <w:rPr>
+        <w:rFonts w:ascii="Courier New" w:hAnsi="Courier New" w:cs="Courier New" w:hint="default"/>
+      </w:rPr>
+    </w:lvl>
+    <w:lvl w:ilvl="2" w:tplc="40090005" w:tentative="1">
+      <w:start w:val="1"/>
+      <w:numFmt w:val="bullet"/>
+      <w:lvlText w:val=""/>
+      <w:lvlJc w:val="left"/>
+      <w:pPr>
+        <w:ind w:left="2160" w:hanging="360"/>
+      </w:pPr>
+      <w:rPr>
+        <w:rFonts w:ascii="Wingdings" w:hAnsi="Wingdings" w:hint="default"/>
+      </w:rPr>
+    </w:lvl>
+    <w:lvl w:ilvl="3" w:tplc="40090001" w:tentative="1">
+      <w:start w:val="1"/>
+      <w:numFmt w:val="bullet"/>
+      <w:lvlText w:val=""/>
+      <w:lvlJc w:val="left"/>
+      <w:pPr>
+        <w:ind w:left="2880" w:hanging="360"/>
+      </w:pPr>
+      <w:rPr>
+        <w:rFonts w:ascii="Symbol" w:hAnsi="Symbol" w:hint="default"/>
+      </w:rPr>
+    </w:lvl>
+    <w:lvl w:ilvl="4" w:tplc="40090003" w:tentative="1">
+      <w:start w:val="1"/>
+      <w:numFmt w:val="bullet"/>
+      <w:lvlText w:val="o"/>
+      <w:lvlJc w:val="left"/>
+      <w:pPr>
+        <w:ind w:left="3600" w:hanging="360"/>
+      </w:pPr>
+      <w:rPr>
+        <w:rFonts w:ascii="Courier New" w:hAnsi="Courier New" w:cs="Courier New" w:hint="default"/>
+      </w:rPr>
+    </w:lvl>
+    <w:lvl w:ilvl="5" w:tplc="40090005" w:tentative="1">
+      <w:start w:val="1"/>
+      <w:numFmt w:val="bullet"/>
+      <w:lvlText w:val=""/>
+      <w:lvlJc w:val="left"/>
+      <w:pPr>
+        <w:ind w:left="4320" w:hanging="360"/>
+      </w:pPr>
+      <w:rPr>
+        <w:rFonts w:ascii="Wingdings" w:hAnsi="Wingdings" w:hint="default"/>
+      </w:rPr>
+    </w:lvl>
+    <w:lvl w:ilvl="6" w:tplc="40090001" w:tentative="1">
+      <w:start w:val="1"/>
+      <w:numFmt w:val="bullet"/>
+      <w:lvlText w:val=""/>
+      <w:lvlJc w:val="left"/>
+      <w:pPr>
+        <w:ind w:left="5040" w:hanging="360"/>
+      </w:pPr>
+      <w:rPr>
+        <w:rFonts w:ascii="Symbol" w:hAnsi="Symbol" w:hint="default"/>
+      </w:rPr>
+    </w:lvl>
+    <w:lvl w:ilvl="7" w:tplc="40090003" w:tentative="1">
+      <w:start w:val="1"/>
+      <w:numFmt w:val="bullet"/>
+      <w:lvlText w:val="o"/>
+      <w:lvlJc w:val="left"/>
+      <w:pPr>
+        <w:ind w:left="5760" w:hanging="360"/>
+      </w:pPr>
+      <w:rPr>
+        <w:rFonts w:ascii="Courier New" w:hAnsi="Courier New" w:cs="Courier New" w:hint="default"/>
+      </w:rPr>
+    </w:lvl>
+    <w:lvl w:ilvl="8" w:tplc="40090005" w:tentative="1">
+      <w:start w:val="1"/>
+      <w:numFmt w:val="bullet"/>
+      <w:lvlText w:val=""/>
+      <w:lvlJc w:val="left"/>
+      <w:pPr>
+        <w:ind w:left="6480" w:hanging="360"/>
+      </w:pPr>
+      <w:rPr>
+        <w:rFonts w:ascii="Wingdings" w:hAnsi="Wingdings" w:hint="default"/>
+      </w:rPr>
+    </w:lvl>
+  </w:abstractNum>
+  <w:abstractNum w:abstractNumId="4" w15:restartNumberingAfterBreak="0">
     <w:nsid w:val="428D4B77"/>
     <w:multiLevelType w:val="hybridMultilevel"/>
     <w:tmpl w:val="8D42B5DE"/>
@@ -2390,7 +3216,7 @@
       </w:rPr>
     </w:lvl>
   </w:abstractNum>
-  <w:abstractNum w:abstractNumId="3" w15:restartNumberingAfterBreak="0">
+  <w:abstractNum w:abstractNumId="5" w15:restartNumberingAfterBreak="0">
     <w:nsid w:val="62C60005"/>
     <w:multiLevelType w:val="hybridMultilevel"/>
     <w:tmpl w:val="9AD6B190"/>
@@ -2503,17 +3329,139 @@
       </w:rPr>
     </w:lvl>
   </w:abstractNum>
+  <w:abstractNum w:abstractNumId="6" w15:restartNumberingAfterBreak="0">
+    <w:nsid w:val="648638E5"/>
+    <w:multiLevelType w:val="hybridMultilevel"/>
+    <w:tmpl w:val="BD18B8DE"/>
+    <w:lvl w:ilvl="0" w:tplc="40090001">
+      <w:start w:val="1"/>
+      <w:numFmt w:val="bullet"/>
+      <w:lvlText w:val=""/>
+      <w:lvlJc w:val="left"/>
+      <w:pPr>
+        <w:ind w:left="720" w:hanging="360"/>
+      </w:pPr>
+      <w:rPr>
+        <w:rFonts w:ascii="Symbol" w:hAnsi="Symbol" w:hint="default"/>
+      </w:rPr>
+    </w:lvl>
+    <w:lvl w:ilvl="1" w:tplc="40090003" w:tentative="1">
+      <w:start w:val="1"/>
+      <w:numFmt w:val="bullet"/>
+      <w:lvlText w:val="o"/>
+      <w:lvlJc w:val="left"/>
+      <w:pPr>
+        <w:ind w:left="1440" w:hanging="360"/>
+      </w:pPr>
+      <w:rPr>
+        <w:rFonts w:ascii="Courier New" w:hAnsi="Courier New" w:cs="Courier New" w:hint="default"/>
+      </w:rPr>
+    </w:lvl>
+    <w:lvl w:ilvl="2" w:tplc="40090005" w:tentative="1">
+      <w:start w:val="1"/>
+      <w:numFmt w:val="bullet"/>
+      <w:lvlText w:val=""/>
+      <w:lvlJc w:val="left"/>
+      <w:pPr>
+        <w:ind w:left="2160" w:hanging="360"/>
+      </w:pPr>
+      <w:rPr>
+        <w:rFonts w:ascii="Wingdings" w:hAnsi="Wingdings" w:hint="default"/>
+      </w:rPr>
+    </w:lvl>
+    <w:lvl w:ilvl="3" w:tplc="40090001" w:tentative="1">
+      <w:start w:val="1"/>
+      <w:numFmt w:val="bullet"/>
+      <w:lvlText w:val=""/>
+      <w:lvlJc w:val="left"/>
+      <w:pPr>
+        <w:ind w:left="2880" w:hanging="360"/>
+      </w:pPr>
+      <w:rPr>
+        <w:rFonts w:ascii="Symbol" w:hAnsi="Symbol" w:hint="default"/>
+      </w:rPr>
+    </w:lvl>
+    <w:lvl w:ilvl="4" w:tplc="40090003" w:tentative="1">
+      <w:start w:val="1"/>
+      <w:numFmt w:val="bullet"/>
+      <w:lvlText w:val="o"/>
+      <w:lvlJc w:val="left"/>
+      <w:pPr>
+        <w:ind w:left="3600" w:hanging="360"/>
+      </w:pPr>
+      <w:rPr>
+        <w:rFonts w:ascii="Courier New" w:hAnsi="Courier New" w:cs="Courier New" w:hint="default"/>
+      </w:rPr>
+    </w:lvl>
+    <w:lvl w:ilvl="5" w:tplc="40090005" w:tentative="1">
+      <w:start w:val="1"/>
+      <w:numFmt w:val="bullet"/>
+      <w:lvlText w:val=""/>
+      <w:lvlJc w:val="left"/>
+      <w:pPr>
+        <w:ind w:left="4320" w:hanging="360"/>
+      </w:pPr>
+      <w:rPr>
+        <w:rFonts w:ascii="Wingdings" w:hAnsi="Wingdings" w:hint="default"/>
+      </w:rPr>
+    </w:lvl>
+    <w:lvl w:ilvl="6" w:tplc="40090001" w:tentative="1">
+      <w:start w:val="1"/>
+      <w:numFmt w:val="bullet"/>
+      <w:lvlText w:val=""/>
+      <w:lvlJc w:val="left"/>
+      <w:pPr>
+        <w:ind w:left="5040" w:hanging="360"/>
+      </w:pPr>
+      <w:rPr>
+        <w:rFonts w:ascii="Symbol" w:hAnsi="Symbol" w:hint="default"/>
+      </w:rPr>
+    </w:lvl>
+    <w:lvl w:ilvl="7" w:tplc="40090003" w:tentative="1">
+      <w:start w:val="1"/>
+      <w:numFmt w:val="bullet"/>
+      <w:lvlText w:val="o"/>
+      <w:lvlJc w:val="left"/>
+      <w:pPr>
+        <w:ind w:left="5760" w:hanging="360"/>
+      </w:pPr>
+      <w:rPr>
+        <w:rFonts w:ascii="Courier New" w:hAnsi="Courier New" w:cs="Courier New" w:hint="default"/>
+      </w:rPr>
+    </w:lvl>
+    <w:lvl w:ilvl="8" w:tplc="40090005" w:tentative="1">
+      <w:start w:val="1"/>
+      <w:numFmt w:val="bullet"/>
+      <w:lvlText w:val=""/>
+      <w:lvlJc w:val="left"/>
+      <w:pPr>
+        <w:ind w:left="6480" w:hanging="360"/>
+      </w:pPr>
+      <w:rPr>
+        <w:rFonts w:ascii="Wingdings" w:hAnsi="Wingdings" w:hint="default"/>
+      </w:rPr>
+    </w:lvl>
+  </w:abstractNum>
   <w:num w:numId="1" w16cid:durableId="2010912759">
-    <w:abstractNumId w:val="0"/>
+    <w:abstractNumId w:val="1"/>
   </w:num>
   <w:num w:numId="2" w16cid:durableId="477575129">
-    <w:abstractNumId w:val="1"/>
+    <w:abstractNumId w:val="2"/>
   </w:num>
   <w:num w:numId="3" w16cid:durableId="944772425">
-    <w:abstractNumId w:val="2"/>
+    <w:abstractNumId w:val="4"/>
   </w:num>
   <w:num w:numId="4" w16cid:durableId="225337209">
+    <w:abstractNumId w:val="5"/>
+  </w:num>
+  <w:num w:numId="5" w16cid:durableId="1771700683">
+    <w:abstractNumId w:val="6"/>
+  </w:num>
+  <w:num w:numId="6" w16cid:durableId="1362782742">
     <w:abstractNumId w:val="3"/>
+  </w:num>
+  <w:num w:numId="7" w16cid:durableId="1022626352">
+    <w:abstractNumId w:val="0"/>
   </w:num>
 </w:numbering>
 </file>

</xml_diff>

<commit_message>
Learn many to many relationships
</commit_message>
<xml_diff>
--- a/section33_postgreSQL/section33_postgreSQLNotes.docx
+++ b/section33_postgreSQL/section33_postgreSQLNotes.docx
@@ -130,25 +130,7 @@
           <w:sz w:val="28"/>
           <w:szCs w:val="28"/>
         </w:rPr>
-        <w:t xml:space="preserve">Advanced Features: Supports advanced data types (JSON, XML, arrays), full-text search, and geospatial data with </w:t>
-      </w:r>
-      <w:proofErr w:type="spellStart"/>
-      <w:r>
-        <w:rPr>
-          <w:rFonts w:ascii="Times New Roman" w:hAnsi="Times New Roman" w:cs="Times New Roman"/>
-          <w:sz w:val="28"/>
-          <w:szCs w:val="28"/>
-        </w:rPr>
-        <w:t>PostGIS</w:t>
-      </w:r>
-      <w:proofErr w:type="spellEnd"/>
-      <w:r>
-        <w:rPr>
-          <w:rFonts w:ascii="Times New Roman" w:hAnsi="Times New Roman" w:cs="Times New Roman"/>
-          <w:sz w:val="28"/>
-          <w:szCs w:val="28"/>
-        </w:rPr>
-        <w:t>.</w:t>
+        <w:t>Advanced Features: Supports advanced data types (JSON, XML, arrays), full-text search, and geospatial data with PostGIS.</w:t>
       </w:r>
     </w:p>
     <w:p>
@@ -479,33 +461,7 @@
           <w:lang w:eastAsia="en-IN"/>
           <w14:ligatures w14:val="none"/>
         </w:rPr>
-        <w:t>"</w:t>
-      </w:r>
-      <w:proofErr w:type="spellStart"/>
-      <w:r>
-        <w:rPr>
-          <w:rFonts w:ascii="Consolas" w:eastAsia="Times New Roman" w:hAnsi="Consolas" w:cs="Times New Roman"/>
-          <w:color w:val="CE9178"/>
-          <w:kern w:val="0"/>
-          <w:sz w:val="27"/>
-          <w:szCs w:val="27"/>
-          <w:lang w:eastAsia="en-IN"/>
-          <w14:ligatures w14:val="none"/>
-        </w:rPr>
-        <w:t>pg</w:t>
-      </w:r>
-      <w:proofErr w:type="spellEnd"/>
-      <w:r>
-        <w:rPr>
-          <w:rFonts w:ascii="Consolas" w:eastAsia="Times New Roman" w:hAnsi="Consolas" w:cs="Times New Roman"/>
-          <w:color w:val="CE9178"/>
-          <w:kern w:val="0"/>
-          <w:sz w:val="27"/>
-          <w:szCs w:val="27"/>
-          <w:lang w:eastAsia="en-IN"/>
-          <w14:ligatures w14:val="none"/>
-        </w:rPr>
-        <w:t>"</w:t>
+        <w:t>"pg"</w:t>
       </w:r>
       <w:r>
         <w:rPr>
@@ -534,7 +490,6 @@
           <w14:ligatures w14:val="none"/>
         </w:rPr>
       </w:pPr>
-      <w:proofErr w:type="spellStart"/>
       <w:r>
         <w:rPr>
           <w:rFonts w:ascii="Consolas" w:eastAsia="Times New Roman" w:hAnsi="Consolas" w:cs="Times New Roman"/>
@@ -547,7 +502,6 @@
         </w:rPr>
         <w:t>const</w:t>
       </w:r>
-      <w:proofErr w:type="spellEnd"/>
       <w:r>
         <w:rPr>
           <w:rFonts w:ascii="Consolas" w:eastAsia="Times New Roman" w:hAnsi="Consolas" w:cs="Times New Roman"/>
@@ -867,33 +821,7 @@
           <w:lang w:eastAsia="en-IN"/>
           <w14:ligatures w14:val="none"/>
         </w:rPr>
-        <w:t>"</w:t>
-      </w:r>
-      <w:proofErr w:type="spellStart"/>
-      <w:r>
-        <w:rPr>
-          <w:rFonts w:ascii="Consolas" w:eastAsia="Times New Roman" w:hAnsi="Consolas" w:cs="Times New Roman"/>
-          <w:color w:val="CE9178"/>
-          <w:kern w:val="0"/>
-          <w:sz w:val="27"/>
-          <w:szCs w:val="27"/>
-          <w:lang w:eastAsia="en-IN"/>
-          <w14:ligatures w14:val="none"/>
-        </w:rPr>
-        <w:t>myDatabase</w:t>
-      </w:r>
-      <w:proofErr w:type="spellEnd"/>
-      <w:r>
-        <w:rPr>
-          <w:rFonts w:ascii="Consolas" w:eastAsia="Times New Roman" w:hAnsi="Consolas" w:cs="Times New Roman"/>
-          <w:color w:val="CE9178"/>
-          <w:kern w:val="0"/>
-          <w:sz w:val="27"/>
-          <w:szCs w:val="27"/>
-          <w:lang w:eastAsia="en-IN"/>
-          <w14:ligatures w14:val="none"/>
-        </w:rPr>
-        <w:t>"</w:t>
+        <w:t>"myDatabase"</w:t>
       </w:r>
       <w:r>
         <w:rPr>
@@ -1087,7 +1015,6 @@
           <w14:ligatures w14:val="none"/>
         </w:rPr>
       </w:pPr>
-      <w:proofErr w:type="spellStart"/>
       <w:r>
         <w:rPr>
           <w:rFonts w:ascii="Consolas" w:eastAsia="Times New Roman" w:hAnsi="Consolas" w:cs="Times New Roman"/>
@@ -1124,7 +1051,6 @@
         </w:rPr>
         <w:t>connect</w:t>
       </w:r>
-      <w:proofErr w:type="spellEnd"/>
       <w:r>
         <w:rPr>
           <w:rFonts w:ascii="Consolas" w:eastAsia="Times New Roman" w:hAnsi="Consolas" w:cs="Times New Roman"/>
@@ -1167,7 +1093,6 @@
           <w14:ligatures w14:val="none"/>
         </w:rPr>
       </w:pPr>
-      <w:proofErr w:type="spellStart"/>
       <w:r>
         <w:rPr>
           <w:rFonts w:ascii="Consolas" w:eastAsia="Times New Roman" w:hAnsi="Consolas" w:cs="Times New Roman"/>
@@ -1204,7 +1129,6 @@
         </w:rPr>
         <w:t>query</w:t>
       </w:r>
-      <w:proofErr w:type="spellEnd"/>
       <w:r>
         <w:rPr>
           <w:rFonts w:ascii="Consolas" w:eastAsia="Times New Roman" w:hAnsi="Consolas" w:cs="Times New Roman"/>
@@ -1388,7 +1312,6 @@
         </w:rPr>
         <w:t xml:space="preserve">) </w:t>
       </w:r>
-      <w:proofErr w:type="spellStart"/>
       <w:r>
         <w:rPr>
           <w:rFonts w:ascii="Consolas" w:eastAsia="Times New Roman" w:hAnsi="Consolas" w:cs="Times New Roman"/>
@@ -1425,7 +1348,6 @@
         </w:rPr>
         <w:t>error</w:t>
       </w:r>
-      <w:proofErr w:type="spellEnd"/>
       <w:r>
         <w:rPr>
           <w:rFonts w:ascii="Consolas" w:eastAsia="Times New Roman" w:hAnsi="Consolas" w:cs="Times New Roman"/>
@@ -1462,7 +1384,6 @@
         </w:rPr>
         <w:t xml:space="preserve">, </w:t>
       </w:r>
-      <w:proofErr w:type="spellStart"/>
       <w:r>
         <w:rPr>
           <w:rFonts w:ascii="Consolas" w:eastAsia="Times New Roman" w:hAnsi="Consolas" w:cs="Times New Roman"/>
@@ -1499,7 +1420,6 @@
         </w:rPr>
         <w:t>stack</w:t>
       </w:r>
-      <w:proofErr w:type="spellEnd"/>
       <w:r>
         <w:rPr>
           <w:rFonts w:ascii="Consolas" w:eastAsia="Times New Roman" w:hAnsi="Consolas" w:cs="Times New Roman"/>
@@ -1635,7 +1555,6 @@
         </w:rPr>
         <w:t xml:space="preserve">, </w:t>
       </w:r>
-      <w:proofErr w:type="spellStart"/>
       <w:r>
         <w:rPr>
           <w:rFonts w:ascii="Consolas" w:eastAsia="Times New Roman" w:hAnsi="Consolas" w:cs="Times New Roman"/>
@@ -1672,7 +1591,6 @@
         </w:rPr>
         <w:t>rows</w:t>
       </w:r>
-      <w:proofErr w:type="spellEnd"/>
       <w:r>
         <w:rPr>
           <w:rFonts w:ascii="Consolas" w:eastAsia="Times New Roman" w:hAnsi="Consolas" w:cs="Times New Roman"/>
@@ -1712,7 +1630,6 @@
         </w:rPr>
         <w:t xml:space="preserve">    </w:t>
       </w:r>
-      <w:proofErr w:type="spellStart"/>
       <w:r>
         <w:rPr>
           <w:rFonts w:ascii="Consolas" w:eastAsia="Times New Roman" w:hAnsi="Consolas" w:cs="Times New Roman"/>
@@ -1749,7 +1666,6 @@
         </w:rPr>
         <w:t>end</w:t>
       </w:r>
-      <w:proofErr w:type="spellEnd"/>
       <w:r>
         <w:rPr>
           <w:rFonts w:ascii="Consolas" w:eastAsia="Times New Roman" w:hAnsi="Consolas" w:cs="Times New Roman"/>
@@ -1811,43 +1727,7 @@
           <w:sz w:val="28"/>
           <w:szCs w:val="28"/>
         </w:rPr>
-        <w:t>Package name: `</w:t>
-      </w:r>
-      <w:proofErr w:type="spellStart"/>
-      <w:r>
-        <w:rPr>
-          <w:rFonts w:ascii="Times New Roman" w:hAnsi="Times New Roman" w:cs="Times New Roman"/>
-          <w:sz w:val="28"/>
-          <w:szCs w:val="28"/>
-        </w:rPr>
-        <w:t>pg</w:t>
-      </w:r>
-      <w:proofErr w:type="spellEnd"/>
-      <w:r>
-        <w:rPr>
-          <w:rFonts w:ascii="Times New Roman" w:hAnsi="Times New Roman" w:cs="Times New Roman"/>
-          <w:sz w:val="28"/>
-          <w:szCs w:val="28"/>
-        </w:rPr>
-        <w:t>` (node-</w:t>
-      </w:r>
-      <w:proofErr w:type="spellStart"/>
-      <w:r>
-        <w:rPr>
-          <w:rFonts w:ascii="Times New Roman" w:hAnsi="Times New Roman" w:cs="Times New Roman"/>
-          <w:sz w:val="28"/>
-          <w:szCs w:val="28"/>
-        </w:rPr>
-        <w:t>postgres</w:t>
-      </w:r>
-      <w:proofErr w:type="spellEnd"/>
-      <w:r>
-        <w:rPr>
-          <w:rFonts w:ascii="Times New Roman" w:hAnsi="Times New Roman" w:cs="Times New Roman"/>
-          <w:sz w:val="28"/>
-          <w:szCs w:val="28"/>
-        </w:rPr>
-        <w:t>).</w:t>
+        <w:t>Package name: `pg` (node-postgres).</w:t>
       </w:r>
     </w:p>
     <w:p>
@@ -2219,7 +2099,6 @@
         </w:rPr>
         <w:t xml:space="preserve"> </w:t>
       </w:r>
-      <w:proofErr w:type="spellStart"/>
       <w:r>
         <w:rPr>
           <w:rFonts w:ascii="Consolas" w:eastAsia="Times New Roman" w:hAnsi="Consolas" w:cs="Times New Roman"/>
@@ -2256,7 +2135,6 @@
         </w:rPr>
         <w:t>query</w:t>
       </w:r>
-      <w:proofErr w:type="spellEnd"/>
       <w:r>
         <w:rPr>
           <w:rFonts w:ascii="Consolas" w:eastAsia="Times New Roman" w:hAnsi="Consolas" w:cs="Times New Roman"/>
@@ -2306,59 +2184,7 @@
           <w:lang w:eastAsia="en-IN"/>
           <w14:ligatures w14:val="none"/>
         </w:rPr>
-        <w:t xml:space="preserve">"INSERT INTO </w:t>
-      </w:r>
-      <w:proofErr w:type="spellStart"/>
-      <w:r>
-        <w:rPr>
-          <w:rFonts w:ascii="Consolas" w:eastAsia="Times New Roman" w:hAnsi="Consolas" w:cs="Times New Roman"/>
-          <w:color w:val="CE9178"/>
-          <w:kern w:val="0"/>
-          <w:sz w:val="27"/>
-          <w:szCs w:val="27"/>
-          <w:lang w:eastAsia="en-IN"/>
-          <w14:ligatures w14:val="none"/>
-        </w:rPr>
-        <w:t>visited_countries</w:t>
-      </w:r>
-      <w:proofErr w:type="spellEnd"/>
-      <w:r>
-        <w:rPr>
-          <w:rFonts w:ascii="Consolas" w:eastAsia="Times New Roman" w:hAnsi="Consolas" w:cs="Times New Roman"/>
-          <w:color w:val="CE9178"/>
-          <w:kern w:val="0"/>
-          <w:sz w:val="27"/>
-          <w:szCs w:val="27"/>
-          <w:lang w:eastAsia="en-IN"/>
-          <w14:ligatures w14:val="none"/>
-        </w:rPr>
-        <w:t xml:space="preserve"> (</w:t>
-      </w:r>
-      <w:proofErr w:type="spellStart"/>
-      <w:r>
-        <w:rPr>
-          <w:rFonts w:ascii="Consolas" w:eastAsia="Times New Roman" w:hAnsi="Consolas" w:cs="Times New Roman"/>
-          <w:color w:val="CE9178"/>
-          <w:kern w:val="0"/>
-          <w:sz w:val="27"/>
-          <w:szCs w:val="27"/>
-          <w:lang w:eastAsia="en-IN"/>
-          <w14:ligatures w14:val="none"/>
-        </w:rPr>
-        <w:t>country_code</w:t>
-      </w:r>
-      <w:proofErr w:type="spellEnd"/>
-      <w:r>
-        <w:rPr>
-          <w:rFonts w:ascii="Consolas" w:eastAsia="Times New Roman" w:hAnsi="Consolas" w:cs="Times New Roman"/>
-          <w:color w:val="CE9178"/>
-          <w:kern w:val="0"/>
-          <w:sz w:val="27"/>
-          <w:szCs w:val="27"/>
-          <w:lang w:eastAsia="en-IN"/>
-          <w14:ligatures w14:val="none"/>
-        </w:rPr>
-        <w:t>) VALUES ($1)"</w:t>
+        <w:t>"INSERT INTO visited_countries (country_code) VALUES ($1)"</w:t>
       </w:r>
       <w:r>
         <w:rPr>
@@ -2399,7 +2225,6 @@
         </w:rPr>
         <w:t>    [</w:t>
       </w:r>
-      <w:proofErr w:type="spellStart"/>
       <w:r>
         <w:rPr>
           <w:rFonts w:ascii="Consolas" w:eastAsia="Times New Roman" w:hAnsi="Consolas" w:cs="Times New Roman"/>
@@ -2412,7 +2237,6 @@
         </w:rPr>
         <w:t>countryCode</w:t>
       </w:r>
-      <w:proofErr w:type="spellEnd"/>
       <w:r>
         <w:rPr>
           <w:rFonts w:ascii="Consolas" w:eastAsia="Times New Roman" w:hAnsi="Consolas" w:cs="Times New Roman"/>
@@ -2634,10 +2458,364 @@
       <w:pPr>
         <w:rPr>
           <w:rFonts w:ascii="Times New Roman" w:hAnsi="Times New Roman" w:cs="Times New Roman"/>
-          <w:sz w:val="28"/>
-          <w:szCs w:val="28"/>
-        </w:rPr>
-      </w:pPr>
+          <w:b/>
+          <w:bCs/>
+          <w:sz w:val="28"/>
+          <w:szCs w:val="28"/>
+        </w:rPr>
+      </w:pPr>
+      <w:r>
+        <w:rPr>
+          <w:rFonts w:ascii="Times New Roman" w:hAnsi="Times New Roman" w:cs="Times New Roman"/>
+          <w:b/>
+          <w:bCs/>
+          <w:sz w:val="28"/>
+          <w:szCs w:val="28"/>
+        </w:rPr>
+        <w:t>258. One to Many Relationships</w:t>
+      </w:r>
+    </w:p>
+    <w:p>
+      <w:pPr>
+        <w:rPr>
+          <w:rFonts w:ascii="Times New Roman" w:hAnsi="Times New Roman" w:cs="Times New Roman"/>
+          <w:sz w:val="28"/>
+          <w:szCs w:val="28"/>
+        </w:rPr>
+      </w:pPr>
+      <w:r>
+        <w:rPr>
+          <w:rFonts w:ascii="Times New Roman" w:hAnsi="Times New Roman" w:cs="Times New Roman"/>
+          <w:sz w:val="28"/>
+          <w:szCs w:val="28"/>
+        </w:rPr>
+        <w:drawing>
+          <wp:inline distT="0" distB="0" distL="0" distR="0" wp14:anchorId="2B8FD9AB" wp14:editId="489E4585">
+            <wp:extent cx="4000706" cy="1981302"/>
+            <wp:effectExtent l="0" t="0" r="0" b="0"/>
+            <wp:docPr id="22841363" name="Picture 1"/>
+            <wp:cNvGraphicFramePr>
+              <a:graphicFrameLocks xmlns:a="http://schemas.openxmlformats.org/drawingml/2006/main" noChangeAspect="1"/>
+            </wp:cNvGraphicFramePr>
+            <a:graphic xmlns:a="http://schemas.openxmlformats.org/drawingml/2006/main">
+              <a:graphicData uri="http://schemas.openxmlformats.org/drawingml/2006/picture">
+                <pic:pic xmlns:pic="http://schemas.openxmlformats.org/drawingml/2006/picture">
+                  <pic:nvPicPr>
+                    <pic:cNvPr id="22841363" name=""/>
+                    <pic:cNvPicPr/>
+                  </pic:nvPicPr>
+                  <pic:blipFill>
+                    <a:blip r:embed="rId9"/>
+                    <a:stretch>
+                      <a:fillRect/>
+                    </a:stretch>
+                  </pic:blipFill>
+                  <pic:spPr>
+                    <a:xfrm>
+                      <a:off x="0" y="0"/>
+                      <a:ext cx="4000706" cy="1981302"/>
+                    </a:xfrm>
+                    <a:prstGeom prst="rect">
+                      <a:avLst/>
+                    </a:prstGeom>
+                  </pic:spPr>
+                </pic:pic>
+              </a:graphicData>
+            </a:graphic>
+          </wp:inline>
+        </w:drawing>
+      </w:r>
+    </w:p>
+    <w:p>
+      <w:pPr>
+        <w:pStyle w:val="ListParagraph"/>
+        <w:numPr>
+          <w:ilvl w:val="0"/>
+          <w:numId w:val="7"/>
+        </w:numPr>
+        <w:rPr>
+          <w:rFonts w:ascii="Times New Roman" w:hAnsi="Times New Roman" w:cs="Times New Roman"/>
+          <w:sz w:val="28"/>
+          <w:szCs w:val="28"/>
+        </w:rPr>
+      </w:pPr>
+      <w:r>
+        <w:rPr>
+          <w:rFonts w:ascii="Times New Roman" w:hAnsi="Times New Roman" w:cs="Times New Roman"/>
+          <w:sz w:val="28"/>
+          <w:szCs w:val="28"/>
+        </w:rPr>
+        <w:t>One to many example.</w:t>
+      </w:r>
+    </w:p>
+    <w:p>
+      <w:pPr>
+        <w:rPr>
+          <w:rFonts w:ascii="Times New Roman" w:hAnsi="Times New Roman" w:cs="Times New Roman"/>
+          <w:sz w:val="28"/>
+          <w:szCs w:val="28"/>
+        </w:rPr>
+      </w:pPr>
+      <w:r>
+        <w:rPr>
+          <w:rFonts w:ascii="Times New Roman" w:hAnsi="Times New Roman" w:cs="Times New Roman"/>
+          <w:sz w:val="28"/>
+          <w:szCs w:val="28"/>
+        </w:rPr>
+        <w:drawing>
+          <wp:inline distT="0" distB="0" distL="0" distR="0" wp14:anchorId="5BB0BB24" wp14:editId="26084D50">
+            <wp:extent cx="3905451" cy="781090"/>
+            <wp:effectExtent l="0" t="0" r="0" b="0"/>
+            <wp:docPr id="342524796" name="Picture 1"/>
+            <wp:cNvGraphicFramePr>
+              <a:graphicFrameLocks xmlns:a="http://schemas.openxmlformats.org/drawingml/2006/main" noChangeAspect="1"/>
+            </wp:cNvGraphicFramePr>
+            <a:graphic xmlns:a="http://schemas.openxmlformats.org/drawingml/2006/main">
+              <a:graphicData uri="http://schemas.openxmlformats.org/drawingml/2006/picture">
+                <pic:pic xmlns:pic="http://schemas.openxmlformats.org/drawingml/2006/picture">
+                  <pic:nvPicPr>
+                    <pic:cNvPr id="342524796" name=""/>
+                    <pic:cNvPicPr/>
+                  </pic:nvPicPr>
+                  <pic:blipFill>
+                    <a:blip r:embed="rId10"/>
+                    <a:stretch>
+                      <a:fillRect/>
+                    </a:stretch>
+                  </pic:blipFill>
+                  <pic:spPr>
+                    <a:xfrm>
+                      <a:off x="0" y="0"/>
+                      <a:ext cx="3905451" cy="781090"/>
+                    </a:xfrm>
+                    <a:prstGeom prst="rect">
+                      <a:avLst/>
+                    </a:prstGeom>
+                  </pic:spPr>
+                </pic:pic>
+              </a:graphicData>
+            </a:graphic>
+          </wp:inline>
+        </w:drawing>
+      </w:r>
+    </w:p>
+    <w:p>
+      <w:pPr>
+        <w:pStyle w:val="ListParagraph"/>
+        <w:numPr>
+          <w:ilvl w:val="0"/>
+          <w:numId w:val="7"/>
+        </w:numPr>
+        <w:rPr>
+          <w:rFonts w:ascii="Times New Roman" w:hAnsi="Times New Roman" w:cs="Times New Roman"/>
+          <w:sz w:val="28"/>
+          <w:szCs w:val="28"/>
+        </w:rPr>
+      </w:pPr>
+      <w:r>
+        <w:rPr>
+          <w:rFonts w:ascii="Times New Roman" w:hAnsi="Times New Roman" w:cs="Times New Roman"/>
+          <w:sz w:val="28"/>
+          <w:szCs w:val="28"/>
+        </w:rPr>
+        <w:t>One to many join</w:t>
+      </w:r>
+      <w:r>
+        <w:rPr>
+          <w:rFonts w:ascii="Times New Roman" w:hAnsi="Times New Roman" w:cs="Times New Roman"/>
+          <w:sz w:val="28"/>
+          <w:szCs w:val="28"/>
+        </w:rPr>
+        <w:t>.</w:t>
+      </w:r>
+      <w:r>
+        <w:rPr>
+          <w:rFonts w:ascii="Times New Roman" w:hAnsi="Times New Roman" w:cs="Times New Roman"/>
+          <w:sz w:val="28"/>
+          <w:szCs w:val="28"/>
+        </w:rPr>
+        <w:t xml:space="preserve"> </w:t>
+      </w:r>
+    </w:p>
+    <w:p>
+      <w:pPr>
+        <w:rPr>
+          <w:rFonts w:ascii="Times New Roman" w:hAnsi="Times New Roman" w:cs="Times New Roman"/>
+          <w:b/>
+          <w:bCs/>
+          <w:sz w:val="28"/>
+          <w:szCs w:val="28"/>
+        </w:rPr>
+      </w:pPr>
+      <w:r>
+        <w:rPr>
+          <w:rFonts w:ascii="Times New Roman" w:hAnsi="Times New Roman" w:cs="Times New Roman"/>
+          <w:b/>
+          <w:bCs/>
+          <w:sz w:val="28"/>
+          <w:szCs w:val="28"/>
+        </w:rPr>
+        <w:t>259. Many to Many Relationships and Aliases</w:t>
+      </w:r>
+    </w:p>
+    <w:p>
+      <w:pPr>
+        <w:rPr>
+          <w:rFonts w:ascii="Times New Roman" w:hAnsi="Times New Roman" w:cs="Times New Roman"/>
+          <w:b/>
+          <w:bCs/>
+          <w:sz w:val="28"/>
+          <w:szCs w:val="28"/>
+        </w:rPr>
+      </w:pPr>
+      <w:r>
+        <w:rPr>
+          <w:rFonts w:ascii="Times New Roman" w:hAnsi="Times New Roman" w:cs="Times New Roman"/>
+          <w:b/>
+          <w:bCs/>
+          <w:sz w:val="28"/>
+          <w:szCs w:val="28"/>
+        </w:rPr>
+        <w:drawing>
+          <wp:inline distT="0" distB="0" distL="0" distR="0" wp14:anchorId="730DBE55" wp14:editId="714BA688">
+            <wp:extent cx="4026107" cy="2857647"/>
+            <wp:effectExtent l="0" t="0" r="0" b="0"/>
+            <wp:docPr id="750601907" name="Picture 1"/>
+            <wp:cNvGraphicFramePr>
+              <a:graphicFrameLocks xmlns:a="http://schemas.openxmlformats.org/drawingml/2006/main" noChangeAspect="1"/>
+            </wp:cNvGraphicFramePr>
+            <a:graphic xmlns:a="http://schemas.openxmlformats.org/drawingml/2006/main">
+              <a:graphicData uri="http://schemas.openxmlformats.org/drawingml/2006/picture">
+                <pic:pic xmlns:pic="http://schemas.openxmlformats.org/drawingml/2006/picture">
+                  <pic:nvPicPr>
+                    <pic:cNvPr id="750601907" name=""/>
+                    <pic:cNvPicPr/>
+                  </pic:nvPicPr>
+                  <pic:blipFill>
+                    <a:blip r:embed="rId11"/>
+                    <a:stretch>
+                      <a:fillRect/>
+                    </a:stretch>
+                  </pic:blipFill>
+                  <pic:spPr>
+                    <a:xfrm>
+                      <a:off x="0" y="0"/>
+                      <a:ext cx="4026107" cy="2857647"/>
+                    </a:xfrm>
+                    <a:prstGeom prst="rect">
+                      <a:avLst/>
+                    </a:prstGeom>
+                  </pic:spPr>
+                </pic:pic>
+              </a:graphicData>
+            </a:graphic>
+          </wp:inline>
+        </w:drawing>
+      </w:r>
+    </w:p>
+    <w:p>
+      <w:pPr>
+        <w:pStyle w:val="ListParagraph"/>
+        <w:numPr>
+          <w:ilvl w:val="0"/>
+          <w:numId w:val="7"/>
+        </w:numPr>
+        <w:rPr>
+          <w:rFonts w:ascii="Times New Roman" w:hAnsi="Times New Roman" w:cs="Times New Roman"/>
+          <w:b/>
+          <w:bCs/>
+          <w:sz w:val="28"/>
+          <w:szCs w:val="28"/>
+        </w:rPr>
+      </w:pPr>
+      <w:r>
+        <w:rPr>
+          <w:rFonts w:ascii="Times New Roman" w:hAnsi="Times New Roman" w:cs="Times New Roman"/>
+          <w:sz w:val="28"/>
+          <w:szCs w:val="28"/>
+        </w:rPr>
+        <w:t>Many to many example.</w:t>
+      </w:r>
+    </w:p>
+    <w:p>
+      <w:pPr>
+        <w:rPr>
+          <w:rFonts w:ascii="Times New Roman" w:hAnsi="Times New Roman" w:cs="Times New Roman"/>
+          <w:b/>
+          <w:bCs/>
+          <w:sz w:val="28"/>
+          <w:szCs w:val="28"/>
+        </w:rPr>
+      </w:pPr>
+      <w:r>
+        <w:rPr>
+          <w:rFonts w:ascii="Times New Roman" w:hAnsi="Times New Roman" w:cs="Times New Roman"/>
+          <w:b/>
+          <w:bCs/>
+          <w:sz w:val="28"/>
+          <w:szCs w:val="28"/>
+        </w:rPr>
+        <w:lastRenderedPageBreak/>
+        <w:drawing>
+          <wp:inline distT="0" distB="0" distL="0" distR="0" wp14:anchorId="0AFBD6A1" wp14:editId="7A6593E9">
+            <wp:extent cx="5105662" cy="1854295"/>
+            <wp:effectExtent l="0" t="0" r="0" b="0"/>
+            <wp:docPr id="791576763" name="Picture 1"/>
+            <wp:cNvGraphicFramePr>
+              <a:graphicFrameLocks xmlns:a="http://schemas.openxmlformats.org/drawingml/2006/main" noChangeAspect="1"/>
+            </wp:cNvGraphicFramePr>
+            <a:graphic xmlns:a="http://schemas.openxmlformats.org/drawingml/2006/main">
+              <a:graphicData uri="http://schemas.openxmlformats.org/drawingml/2006/picture">
+                <pic:pic xmlns:pic="http://schemas.openxmlformats.org/drawingml/2006/picture">
+                  <pic:nvPicPr>
+                    <pic:cNvPr id="791576763" name=""/>
+                    <pic:cNvPicPr/>
+                  </pic:nvPicPr>
+                  <pic:blipFill>
+                    <a:blip r:embed="rId12"/>
+                    <a:stretch>
+                      <a:fillRect/>
+                    </a:stretch>
+                  </pic:blipFill>
+                  <pic:spPr>
+                    <a:xfrm>
+                      <a:off x="0" y="0"/>
+                      <a:ext cx="5105662" cy="1854295"/>
+                    </a:xfrm>
+                    <a:prstGeom prst="rect">
+                      <a:avLst/>
+                    </a:prstGeom>
+                  </pic:spPr>
+                </pic:pic>
+              </a:graphicData>
+            </a:graphic>
+          </wp:inline>
+        </w:drawing>
+      </w:r>
+    </w:p>
+    <w:p>
+      <w:pPr>
+        <w:pStyle w:val="ListParagraph"/>
+        <w:numPr>
+          <w:ilvl w:val="0"/>
+          <w:numId w:val="7"/>
+        </w:numPr>
+        <w:rPr>
+          <w:rFonts w:ascii="Times New Roman" w:hAnsi="Times New Roman" w:cs="Times New Roman"/>
+          <w:b/>
+          <w:bCs/>
+          <w:sz w:val="28"/>
+          <w:szCs w:val="28"/>
+        </w:rPr>
+      </w:pPr>
+      <w:r>
+        <w:rPr>
+          <w:rFonts w:ascii="Times New Roman" w:hAnsi="Times New Roman" w:cs="Times New Roman"/>
+          <w:sz w:val="28"/>
+          <w:szCs w:val="28"/>
+        </w:rPr>
+        <w:t>Many to many join.</w:t>
+      </w:r>
     </w:p>
     <w:sectPr>
       <w:pgSz w:w="11906" w:h="16838"/>
@@ -2654,7 +2832,7 @@
   <w:abstractNum w:abstractNumId="0" w15:restartNumberingAfterBreak="0">
     <w:nsid w:val="010F485B"/>
     <w:multiLevelType w:val="hybridMultilevel"/>
-    <w:tmpl w:val="BF3846C8"/>
+    <w:tmpl w:val="56AC646A"/>
     <w:lvl w:ilvl="0" w:tplc="40090001">
       <w:start w:val="1"/>
       <w:numFmt w:val="bullet"/>

</xml_diff>